<commit_message>
Commit prima di nuova riclassificazione
</commit_message>
<xml_diff>
--- a/macro-etichette-etichettato.docx
+++ b/macro-etichette-etichettato.docx
@@ -95,7 +95,27 @@
           <w:szCs w:val="18"/>
           <w:lang w:val="it-IT"/>
         </w:rPr>
-        <w:t>MACRO-ETICHETTA: etichette specifiche usate per la classificazione</w:t>
+        <w:t xml:space="preserve">MACRO-ETICHETTA: </w:t>
+      </w:r>
+      <w:r>
+        <w:rPr>
+          <w:rFonts w:cs="Liberation Mono"/>
+          <w:color w:val="000000"/>
+          <w:sz w:val="18"/>
+          <w:szCs w:val="18"/>
+          <w:lang w:val="it-IT"/>
+        </w:rPr>
+        <w:t xml:space="preserve">lista delle </w:t>
+      </w:r>
+      <w:r>
+        <w:rPr>
+          <w:rFonts w:cs="Liberation Mono"/>
+          <w:color w:val="000000"/>
+          <w:sz w:val="18"/>
+          <w:szCs w:val="18"/>
+          <w:lang w:val="it-IT"/>
+        </w:rPr>
+        <w:t>etichette specifiche usate per la classificazione</w:t>
       </w:r>
     </w:p>
     <w:p>
@@ -212,13 +232,10 @@
       <w:pPr>
         <w:pStyle w:val="Testopreformattatouser"/>
         <w:rPr>
-          <w:rFonts w:cs="Liberation Mono"/>
-          <w:color w:val="000000"/>
-          <w:sz w:val="18"/>
-          <w:szCs w:val="18"/>
-          <w:highlight w:val="none"/>
-          <w:shd w:fill="FFA6A6" w:val="clear"/>
-          <w:lang w:val="it-IT"/>
+          <w:rFonts w:ascii="Liberation Mono" w:hAnsi="Liberation Mono" w:cs="Liberation Mono"/>
+          <w:color w:val="000000"/>
+          <w:sz w:val="18"/>
+          <w:szCs w:val="18"/>
         </w:rPr>
       </w:pPr>
       <w:r>
@@ -227,10 +244,7 @@
           <w:color w:val="000000"/>
           <w:sz w:val="18"/>
           <w:szCs w:val="18"/>
-          <w:shd w:fill="FFA6A6" w:val="clear"/>
-          <w:lang w:val="it-IT"/>
-        </w:rPr>
-        <w:t>In rosa più scuro etichette che erano state “dimenticate” e che richiedono una discussione.</w:t>
+        </w:rPr>
       </w:r>
     </w:p>
     <w:p>
@@ -249,7 +263,9 @@
           <w:color w:val="000000"/>
           <w:sz w:val="18"/>
           <w:szCs w:val="18"/>
-        </w:rPr>
+          <w:lang w:val="it-IT"/>
+        </w:rPr>
+        <w:t>Le etichette che erano duplicate nella classificazione delle risposte a domande differenti sono state premesse dalla sigla della domanda (D1, D2, D3). In alcuni casi fanno parte della stessa macro-etichetta, in altri sono rimasti in macro-etichette differenti.</w:t>
       </w:r>
     </w:p>
     <w:p>
@@ -268,9 +284,7 @@
           <w:color w:val="000000"/>
           <w:sz w:val="18"/>
           <w:szCs w:val="18"/>
-          <w:lang w:val="it-IT"/>
-        </w:rPr>
-        <w:t>Le etichette che erano duplicate nella classificazione delle risposte a domande differenti sono state premesse dalla sigla della domanda (D1, D2, D3). In alcuni casi fanno parte della stessa macro-etichetta, in altri sono rimasti in macro-etichette differenti.</w:t>
+        </w:rPr>
       </w:r>
     </w:p>
     <w:p>
@@ -289,7 +303,9 @@
           <w:color w:val="000000"/>
           <w:sz w:val="18"/>
           <w:szCs w:val="18"/>
-        </w:rPr>
+          <w:lang w:val="it-IT"/>
+        </w:rPr>
+        <w:t>Dovremo fare attenzione nella fase di analisi al fatto che diverse macro-etichette usate per le attività e per gli obiettivi disciplinari sono fortemente correlate.</w:t>
       </w:r>
     </w:p>
     <w:p>
@@ -308,9 +324,7 @@
           <w:color w:val="000000"/>
           <w:sz w:val="18"/>
           <w:szCs w:val="18"/>
-          <w:lang w:val="it-IT"/>
-        </w:rPr>
-        <w:t>Dovremo fare attenzione nella fase di analisi al fatto che diverse macro-etichette usate per le attività e per gli obiettivi disciplinari sono fortemente correlate.</w:t>
+        </w:rPr>
       </w:r>
     </w:p>
     <w:p>
@@ -329,7 +343,9 @@
           <w:color w:val="000000"/>
           <w:sz w:val="18"/>
           <w:szCs w:val="18"/>
-        </w:rPr>
+          <w:lang w:val="it-IT"/>
+        </w:rPr>
+        <w:t>NOTE PER ANALISI AUTOMATICA:</w:t>
       </w:r>
     </w:p>
     <w:p>
@@ -350,7 +366,17 @@
           <w:szCs w:val="18"/>
           <w:lang w:val="it-IT"/>
         </w:rPr>
-        <w:t>NOTE PER ANALISI AUTOMATICA:</w:t>
+        <w:t xml:space="preserve">  </w:t>
+      </w:r>
+      <w:r>
+        <w:rPr>
+          <w:rFonts w:cs="Liberation Mono"/>
+          <w:color w:val="000000"/>
+          <w:sz w:val="18"/>
+          <w:szCs w:val="18"/>
+          <w:lang w:val="it-IT"/>
+        </w:rPr>
+        <w:t>attenzione a spazi prima/dopo la barra “/”</w:t>
       </w:r>
     </w:p>
     <w:p>
@@ -371,17 +397,17 @@
           <w:szCs w:val="18"/>
           <w:lang w:val="it-IT"/>
         </w:rPr>
-        <w:t xml:space="preserve">  </w:t>
-      </w:r>
-      <w:r>
-        <w:rPr>
-          <w:rFonts w:cs="Liberation Mono"/>
-          <w:color w:val="000000"/>
-          <w:sz w:val="18"/>
-          <w:szCs w:val="18"/>
-          <w:lang w:val="it-IT"/>
-        </w:rPr>
-        <w:t>attenzione a spazi prima/dopo la barra “/”</w:t>
+        <w:t xml:space="preserve">  “</w:t>
+      </w:r>
+      <w:r>
+        <w:rPr>
+          <w:rFonts w:cs="Liberation Mono"/>
+          <w:color w:val="000000"/>
+          <w:sz w:val="18"/>
+          <w:szCs w:val="18"/>
+          <w:lang w:val="it-IT"/>
+        </w:rPr>
+        <w:t>decomposizione” dovrà diventare “scomposizione”</w:t>
       </w:r>
     </w:p>
     <w:p>
@@ -410,9 +436,10 @@
           <w:color w:val="000000"/>
           <w:sz w:val="18"/>
           <w:szCs w:val="18"/>
-          <w:lang w:val="it-IT"/>
-        </w:rPr>
-        <w:t>decomposizione” dovrà diventare “scomposizione”</w:t>
+          <w:shd w:fill="auto" w:val="clear"/>
+          <w:lang w:val="it-IT"/>
+        </w:rPr>
+        <w:t>osservazione/ memoria/ analisi” è scritta nei fogli di classificazione come “osservazione, memoria, analisi”</w:t>
       </w:r>
     </w:p>
     <w:p>
@@ -431,20 +458,21 @@
           <w:color w:val="000000"/>
           <w:sz w:val="18"/>
           <w:szCs w:val="18"/>
-          <w:lang w:val="it-IT"/>
-        </w:rPr>
-        <w:t xml:space="preserve">  “</w:t>
-      </w:r>
-      <w:r>
-        <w:rPr>
-          <w:rFonts w:cs="Liberation Mono"/>
-          <w:color w:val="000000"/>
-          <w:sz w:val="18"/>
-          <w:szCs w:val="18"/>
-          <w:shd w:fill="auto" w:val="clear"/>
-          <w:lang w:val="it-IT"/>
-        </w:rPr>
-        <w:t>osservazione/ memoria/ analisi” è scritta nei fogli di classificazione come “osservazione, memoria, analisi”</w:t>
+          <w:shd w:fill="auto" w:val="clear"/>
+          <w:lang w:val="it-IT"/>
+        </w:rPr>
+        <w:t xml:space="preserve">  </w:t>
+      </w:r>
+      <w:r>
+        <w:rPr>
+          <w:rFonts w:cs="Liberation Mono"/>
+          <w:color w:val="000000"/>
+          <w:sz w:val="18"/>
+          <w:szCs w:val="18"/>
+          <w:shd w:fill="auto" w:val="clear"/>
+          <w:lang w:val="it-IT"/>
+        </w:rPr>
+        <w:t>le etichette -dedot sono state tolte perché nei fogli di classificazione compaiono nella cella e non nel nome della colonna</w:t>
       </w:r>
     </w:p>
     <w:p>
@@ -463,21 +491,7 @@
           <w:color w:val="000000"/>
           <w:sz w:val="18"/>
           <w:szCs w:val="18"/>
-          <w:shd w:fill="auto" w:val="clear"/>
-          <w:lang w:val="it-IT"/>
-        </w:rPr>
-        <w:t xml:space="preserve">  </w:t>
-      </w:r>
-      <w:r>
-        <w:rPr>
-          <w:rFonts w:cs="Liberation Mono"/>
-          <w:color w:val="000000"/>
-          <w:sz w:val="18"/>
-          <w:szCs w:val="18"/>
-          <w:shd w:fill="auto" w:val="clear"/>
-          <w:lang w:val="it-IT"/>
-        </w:rPr>
-        <w:t>le etichette -dedot sono state tolte perché nei fogli di classificazione compaiono nella cella e non nel nome della colonna</w:t>
+        </w:rPr>
       </w:r>
     </w:p>
     <w:p>
@@ -496,7 +510,9 @@
           <w:color w:val="000000"/>
           <w:sz w:val="18"/>
           <w:szCs w:val="18"/>
-        </w:rPr>
+          <w:lang w:val="it-IT"/>
+        </w:rPr>
+        <w:t>=====================================================================================</w:t>
       </w:r>
     </w:p>
     <w:p>
@@ -515,9 +531,7 @@
           <w:color w:val="000000"/>
           <w:sz w:val="18"/>
           <w:szCs w:val="18"/>
-          <w:lang w:val="it-IT"/>
-        </w:rPr>
-        <w:t>=====================================================================================</w:t>
+        </w:rPr>
       </w:r>
     </w:p>
     <w:p>
@@ -536,7 +550,9 @@
           <w:color w:val="000000"/>
           <w:sz w:val="18"/>
           <w:szCs w:val="18"/>
-        </w:rPr>
+          <w:lang w:val="it-IT"/>
+        </w:rPr>
+        <w:t>====</w:t>
       </w:r>
     </w:p>
     <w:p>
@@ -557,7 +573,7 @@
           <w:szCs w:val="18"/>
           <w:lang w:val="it-IT"/>
         </w:rPr>
-        <w:t>====</w:t>
+        <w:t>D1</w:t>
       </w:r>
     </w:p>
     <w:p>
@@ -578,7 +594,7 @@
           <w:szCs w:val="18"/>
           <w:lang w:val="it-IT"/>
         </w:rPr>
-        <w:t>D1</w:t>
+        <w:t>====</w:t>
       </w:r>
     </w:p>
     <w:p>
@@ -597,9 +613,7 @@
           <w:color w:val="000000"/>
           <w:sz w:val="18"/>
           <w:szCs w:val="18"/>
-          <w:lang w:val="it-IT"/>
-        </w:rPr>
-        <w:t>====</w:t>
+        </w:rPr>
       </w:r>
     </w:p>
     <w:p>
@@ -618,17 +632,17 @@
           <w:color w:val="000000"/>
           <w:sz w:val="18"/>
           <w:szCs w:val="18"/>
-        </w:rPr>
+          <w:lang w:val="it-IT"/>
+        </w:rPr>
+        <w:t>—————————————————————————</w:t>
       </w:r>
     </w:p>
     <w:p>
       <w:pPr>
         <w:pStyle w:val="Testopreformattatouser"/>
         <w:rPr>
-          <w:rFonts w:ascii="Liberation Mono" w:hAnsi="Liberation Mono" w:cs="Liberation Mono"/>
-          <w:color w:val="000000"/>
-          <w:sz w:val="18"/>
-          <w:szCs w:val="18"/>
+          <w:highlight w:val="none"/>
+          <w:shd w:fill="FFFF00" w:val="clear"/>
         </w:rPr>
       </w:pPr>
       <w:r>
@@ -637,9 +651,10 @@
           <w:color w:val="000000"/>
           <w:sz w:val="18"/>
           <w:szCs w:val="18"/>
-          <w:lang w:val="it-IT"/>
-        </w:rPr>
-        <w:t>—————————————————————————</w:t>
+          <w:shd w:fill="FFFF00" w:val="clear"/>
+          <w:lang w:val="it-IT"/>
+        </w:rPr>
+        <w:t>materiali/strumenti fisici</w:t>
       </w:r>
     </w:p>
     <w:p>
@@ -647,7 +662,7 @@
         <w:pStyle w:val="Testopreformattatouser"/>
         <w:rPr>
           <w:highlight w:val="none"/>
-          <w:shd w:fill="FFFF00" w:val="clear"/>
+          <w:shd w:fill="auto" w:val="clear"/>
         </w:rPr>
       </w:pPr>
       <w:r>
@@ -656,10 +671,21 @@
           <w:color w:val="000000"/>
           <w:sz w:val="18"/>
           <w:szCs w:val="18"/>
-          <w:shd w:fill="FFFF00" w:val="clear"/>
-          <w:lang w:val="it-IT"/>
-        </w:rPr>
-        <w:t>materiali/strumenti fisici</w:t>
+          <w:shd w:fill="auto" w:val="clear"/>
+          <w:lang w:val="it-IT"/>
+        </w:rPr>
+        <w:t xml:space="preserve">  </w:t>
+      </w:r>
+      <w:r>
+        <w:rPr>
+          <w:rFonts w:cs="Liberation Mono"/>
+          <w:color w:val="000000"/>
+          <w:sz w:val="18"/>
+          <w:szCs w:val="18"/>
+          <w:shd w:fill="auto" w:val="clear"/>
+          <w:lang w:val="it-IT"/>
+        </w:rPr>
+        <w:t>MATERIALI DI AMBIENTE/MOVIMENTO IN CUI SI OPERA PER LE ATTIVITÀ: tappeto, griglia/scacchiera, retta dei numeri.</w:t>
       </w:r>
     </w:p>
     <w:p>
@@ -690,7 +716,7 @@
           <w:shd w:fill="auto" w:val="clear"/>
           <w:lang w:val="it-IT"/>
         </w:rPr>
-        <w:t>MATERIALI DI AMBIENTE/MOVIMENTO IN CUI SI OPERA PER LE ATTIVITÀ: tappeto, griglia/scacchiera, retta dei numeri.</w:t>
+        <w:t>MATERIALI CHE GUIDANO/STRUTTURANO ATTIVITÀ: schede, dalla piattaforma, slide, libri.</w:t>
       </w:r>
     </w:p>
     <w:p>
@@ -721,7 +747,7 @@
           <w:shd w:fill="auto" w:val="clear"/>
           <w:lang w:val="it-IT"/>
         </w:rPr>
-        <w:t>MATERIALI CHE GUIDANO/STRUTTURANO ATTIVITÀ: schede, dalla piattaforma, slide, libri.</w:t>
+        <w:t>CANCELLERIA/USO COMUNE: quaderno, carta/ cartoncino, penna/rello, cancellini, segnalini, riciclo, altri materiali.</w:t>
       </w:r>
     </w:p>
     <w:p>
@@ -752,7 +778,7 @@
           <w:shd w:fill="auto" w:val="clear"/>
           <w:lang w:val="it-IT"/>
         </w:rPr>
-        <w:t>CANCELLERIA/USO COMUNE: quaderno, carta/ cartoncino, penna/rello, cancellini, segnalini, riciclo, altri materiali.</w:t>
+        <w:t>CORPO: corpo, occhi, mani.</w:t>
       </w:r>
     </w:p>
     <w:p>
@@ -783,7 +809,7 @@
           <w:shd w:fill="auto" w:val="clear"/>
           <w:lang w:val="it-IT"/>
         </w:rPr>
-        <w:t>CORPO: corpo, occhi, mani.</w:t>
+        <w:t>ROBOT: robot.</w:t>
       </w:r>
     </w:p>
     <w:p>
@@ -814,7 +840,7 @@
           <w:shd w:fill="auto" w:val="clear"/>
           <w:lang w:val="it-IT"/>
         </w:rPr>
-        <w:t>ROBOT: robot.</w:t>
+        <w:t>PC/TABLET: PC/tablet.</w:t>
       </w:r>
     </w:p>
     <w:p>
@@ -845,7 +871,7 @@
           <w:shd w:fill="auto" w:val="clear"/>
           <w:lang w:val="it-IT"/>
         </w:rPr>
-        <w:t>PC/TABLET: PC/tablet.</w:t>
+        <w:t>CARTE/BLOCCHI: carte / blocchi di programmazione.</w:t>
       </w:r>
     </w:p>
     <w:p>
@@ -876,13 +902,17 @@
           <w:shd w:fill="auto" w:val="clear"/>
           <w:lang w:val="it-IT"/>
         </w:rPr>
-        <w:t>CARTE/BLOCCHI: carte / blocchi di programmazione.</w:t>
+        <w:t>LIM: LIM.</w:t>
       </w:r>
     </w:p>
     <w:p>
       <w:pPr>
         <w:pStyle w:val="Testopreformattatouser"/>
         <w:rPr>
+          <w:rFonts w:ascii="Liberation Mono" w:hAnsi="Liberation Mono" w:cs="Liberation Mono"/>
+          <w:color w:val="000000"/>
+          <w:sz w:val="18"/>
+          <w:szCs w:val="18"/>
           <w:highlight w:val="none"/>
           <w:shd w:fill="auto" w:val="clear"/>
         </w:rPr>
@@ -894,20 +924,7 @@
           <w:sz w:val="18"/>
           <w:szCs w:val="18"/>
           <w:shd w:fill="auto" w:val="clear"/>
-          <w:lang w:val="it-IT"/>
-        </w:rPr>
-        <w:t xml:space="preserve">  </w:t>
-      </w:r>
-      <w:r>
-        <w:rPr>
-          <w:rFonts w:cs="Liberation Mono"/>
-          <w:color w:val="000000"/>
-          <w:sz w:val="18"/>
-          <w:szCs w:val="18"/>
-          <w:shd w:fill="auto" w:val="clear"/>
-          <w:lang w:val="it-IT"/>
-        </w:rPr>
-        <w:t>LIM: LIM.</w:t>
+        </w:rPr>
       </w:r>
     </w:p>
     <w:p>
@@ -918,8 +935,6 @@
           <w:color w:val="000000"/>
           <w:sz w:val="18"/>
           <w:szCs w:val="18"/>
-          <w:highlight w:val="none"/>
-          <w:shd w:fill="auto" w:val="clear"/>
         </w:rPr>
       </w:pPr>
       <w:r>
@@ -928,18 +943,17 @@
           <w:color w:val="000000"/>
           <w:sz w:val="18"/>
           <w:szCs w:val="18"/>
-          <w:shd w:fill="auto" w:val="clear"/>
-        </w:rPr>
+          <w:lang w:val="it-IT"/>
+        </w:rPr>
+        <w:t>—————————————————————————</w:t>
       </w:r>
     </w:p>
     <w:p>
       <w:pPr>
         <w:pStyle w:val="Testopreformattatouser"/>
         <w:rPr>
-          <w:rFonts w:ascii="Liberation Mono" w:hAnsi="Liberation Mono" w:cs="Liberation Mono"/>
-          <w:color w:val="000000"/>
-          <w:sz w:val="18"/>
-          <w:szCs w:val="18"/>
+          <w:highlight w:val="none"/>
+          <w:shd w:fill="FFFF00" w:val="clear"/>
         </w:rPr>
       </w:pPr>
       <w:r>
@@ -948,9 +962,10 @@
           <w:color w:val="000000"/>
           <w:sz w:val="18"/>
           <w:szCs w:val="18"/>
-          <w:lang w:val="it-IT"/>
-        </w:rPr>
-        <w:t>—————————————————————————</w:t>
+          <w:shd w:fill="FFFF00" w:val="clear"/>
+          <w:lang w:val="it-IT"/>
+        </w:rPr>
+        <w:t>attività</w:t>
       </w:r>
     </w:p>
     <w:p>
@@ -958,7 +973,7 @@
         <w:pStyle w:val="Testopreformattatouser"/>
         <w:rPr>
           <w:highlight w:val="none"/>
-          <w:shd w:fill="FFFF00" w:val="clear"/>
+          <w:shd w:fill="auto" w:val="clear"/>
         </w:rPr>
       </w:pPr>
       <w:r>
@@ -967,10 +982,21 @@
           <w:color w:val="000000"/>
           <w:sz w:val="18"/>
           <w:szCs w:val="18"/>
-          <w:shd w:fill="FFFF00" w:val="clear"/>
-          <w:lang w:val="it-IT"/>
-        </w:rPr>
-        <w:t>attività</w:t>
+          <w:shd w:fill="auto" w:val="clear"/>
+          <w:lang w:val="it-IT"/>
+        </w:rPr>
+        <w:t xml:space="preserve">  </w:t>
+      </w:r>
+      <w:r>
+        <w:rPr>
+          <w:rFonts w:cs="Liberation Mono"/>
+          <w:color w:val="000000"/>
+          <w:sz w:val="18"/>
+          <w:szCs w:val="18"/>
+          <w:shd w:fill="auto" w:val="clear"/>
+          <w:lang w:val="it-IT"/>
+        </w:rPr>
+        <w:t>UNPLUGGED: D1_coding unplugged, attività unplugged, D1_coding analogico.</w:t>
       </w:r>
     </w:p>
     <w:p>
@@ -1001,7 +1027,7 @@
           <w:shd w:fill="auto" w:val="clear"/>
           <w:lang w:val="it-IT"/>
         </w:rPr>
-        <w:t>UNPLUGGED: D1_coding unplugged, attività unplugged, D1_coding analogico.</w:t>
+        <w:t>CODING: D1_coding.</w:t>
       </w:r>
     </w:p>
     <w:p>
@@ -1032,7 +1058,7 @@
           <w:shd w:fill="auto" w:val="clear"/>
           <w:lang w:val="it-IT"/>
         </w:rPr>
-        <w:t>CODING: D1_coding.</w:t>
+        <w:t>STRUMENTALI PER ALTRE DISCIPLINE: aritmetica, costruzione mappe, D1_geografia, D1_geometria, presentazione di una regione, misure, origami, scienza, riferimenti topologici, techno-CLIL.</w:t>
       </w:r>
     </w:p>
     <w:p>
@@ -1063,29 +1089,7 @@
           <w:shd w:fill="auto" w:val="clear"/>
           <w:lang w:val="it-IT"/>
         </w:rPr>
-        <w:t xml:space="preserve">STRUMENTALI PER ALTRE DISCIPLINE: aritmetica, costruzione mappe, D1_geografia, D1_geometria, presentazione di una regione, misure, origami, scienza, riferimenti topologici, techno-CLIL, </w:t>
-      </w:r>
-      <w:r>
-        <w:rPr>
-          <w:rFonts w:cs="Liberation Mono"/>
-          <w:color w:val="000000"/>
-          <w:sz w:val="18"/>
-          <w:szCs w:val="18"/>
-          <w:shd w:fill="FFA6A6" w:val="clear"/>
-          <w:lang w:val="it-IT"/>
-        </w:rPr>
-        <w:t>D1_orientamento spaziale</w:t>
-      </w:r>
-      <w:r>
-        <w:rPr>
-          <w:rFonts w:cs="Liberation Mono"/>
-          <w:color w:val="000000"/>
-          <w:sz w:val="18"/>
-          <w:szCs w:val="18"/>
-          <w:shd w:fill="auto" w:val="clear"/>
-          <w:lang w:val="it-IT"/>
-        </w:rPr>
-        <w:t>.</w:t>
+        <w:t>PROGRAMMAZIONE: D1_programmazione.</w:t>
       </w:r>
     </w:p>
     <w:p>
@@ -1116,7 +1120,7 @@
           <w:shd w:fill="auto" w:val="clear"/>
           <w:lang w:val="it-IT"/>
         </w:rPr>
-        <w:t>PROGRAMMAZIONE: D1_programmazione.</w:t>
+        <w:t>COSTRUTTI DI BASE: D1_cicli, istruzioni condizionali, istruzioni di base, D1_sequenza, variabili.</w:t>
       </w:r>
     </w:p>
     <w:p>
@@ -1147,7 +1151,7 @@
           <w:shd w:fill="auto" w:val="clear"/>
           <w:lang w:val="it-IT"/>
         </w:rPr>
-        <w:t>COSTRUTTI DI BASE: D1_cicli, istruzioni condizionali, istruzioni di base, D1_sequenza, variabili.</w:t>
+        <w:t>CONTENUTI ALGORITMICI: algoritmi, diagramma di flusso, pseudo-linguaggio, strutture dati.</w:t>
       </w:r>
     </w:p>
     <w:p>
@@ -1178,7 +1182,7 @@
           <w:shd w:fill="auto" w:val="clear"/>
           <w:lang w:val="it-IT"/>
         </w:rPr>
-        <w:t>CONTENUTI ALGORITMICI: algoritmi, diagramma di flusso, pseudo-linguaggio, strutture dati.</w:t>
+        <w:t>VERIFICA E CORREZIONE: verifica e correzione.</w:t>
       </w:r>
     </w:p>
     <w:p>
@@ -1209,7 +1213,18 @@
           <w:shd w:fill="auto" w:val="clear"/>
           <w:lang w:val="it-IT"/>
         </w:rPr>
-        <w:t>VERIFICA E CORREZIONE: verifica e correzione.</w:t>
+        <w:t>PROCESSI DI INFORMATICA: D1_esecuzione di istruzioni, lettura codice, sviluppo iterativo, D1_decomposizione</w:t>
+      </w:r>
+      <w:r>
+        <w:rPr>
+          <w:rFonts w:cs="Liberation Mono"/>
+          <w:color w:val="000000"/>
+          <w:sz w:val="18"/>
+          <w:szCs w:val="18"/>
+          <w:shd w:fill="auto" w:val="clear"/>
+          <w:lang w:val="it-IT"/>
+        </w:rPr>
+        <w:t>.</w:t>
       </w:r>
     </w:p>
     <w:p>
@@ -1240,29 +1255,7 @@
           <w:shd w:fill="auto" w:val="clear"/>
           <w:lang w:val="it-IT"/>
         </w:rPr>
-        <w:t xml:space="preserve">PROCESSI DI INFORMATICA: D1_esecuzione di istruzioni, lettura codice, sviluppo iterativo, D1_decomposizione, </w:t>
-      </w:r>
-      <w:r>
-        <w:rPr>
-          <w:rFonts w:cs="Liberation Mono"/>
-          <w:color w:val="000000"/>
-          <w:sz w:val="18"/>
-          <w:szCs w:val="18"/>
-          <w:shd w:fill="FFA6A6" w:val="clear"/>
-          <w:lang w:val="it-IT"/>
-        </w:rPr>
-        <w:t>D1_pensiero computazionale</w:t>
-      </w:r>
-      <w:r>
-        <w:rPr>
-          <w:rFonts w:cs="Liberation Mono"/>
-          <w:color w:val="000000"/>
-          <w:sz w:val="18"/>
-          <w:szCs w:val="18"/>
-          <w:shd w:fill="auto" w:val="clear"/>
-          <w:lang w:val="it-IT"/>
-        </w:rPr>
-        <w:t>.</w:t>
+        <w:t>USO TECNOLOGIA E SVILUPPO CONTENUTI: D1_sviluppo contenuti2, D1_uso della tecnologia, ricerca informazioni.</w:t>
       </w:r>
     </w:p>
     <w:p>
@@ -1293,7 +1286,7 @@
           <w:shd w:fill="auto" w:val="clear"/>
           <w:lang w:val="it-IT"/>
         </w:rPr>
-        <w:t>USO TECNOLOGIA E SVILUPPO CONTENUTI: D1_sviluppo contenuti2, D1_uso della tecnologia, ricerca informazioni.</w:t>
+        <w:t>VIDEOGIOCHI: giochi disciplinari interattivi / attività ludiche.</w:t>
       </w:r>
     </w:p>
     <w:p>
@@ -1324,7 +1317,7 @@
           <w:shd w:fill="auto" w:val="clear"/>
           <w:lang w:val="it-IT"/>
         </w:rPr>
-        <w:t>VIDEOGIOCHI: giochi disciplinari interattivi / attività ludiche.</w:t>
+        <w:t>MOVIMENTO E PERCORSI: ludico/motoria, percorsi.</w:t>
       </w:r>
     </w:p>
     <w:p>
@@ -1355,80 +1348,7 @@
           <w:shd w:fill="auto" w:val="clear"/>
           <w:lang w:val="it-IT"/>
         </w:rPr>
-        <w:t>MOVIMENTO E PERCORSI: ludico/motoria, percorsi.</w:t>
-      </w:r>
-    </w:p>
-    <w:p>
-      <w:pPr>
-        <w:pStyle w:val="Testopreformattatouser"/>
-        <w:rPr>
-          <w:highlight w:val="none"/>
-          <w:shd w:fill="auto" w:val="clear"/>
-        </w:rPr>
-      </w:pPr>
-      <w:r>
-        <w:rPr>
-          <w:rFonts w:cs="Liberation Mono"/>
-          <w:color w:val="000000"/>
-          <w:sz w:val="18"/>
-          <w:szCs w:val="18"/>
-          <w:shd w:fill="auto" w:val="clear"/>
-          <w:lang w:val="it-IT"/>
-        </w:rPr>
-        <w:t xml:space="preserve">  </w:t>
-      </w:r>
-      <w:r>
-        <w:rPr>
-          <w:rFonts w:cs="Liberation Mono"/>
-          <w:color w:val="000000"/>
-          <w:sz w:val="18"/>
-          <w:szCs w:val="18"/>
-          <w:shd w:fill="FFA6A6" w:val="clear"/>
-          <w:lang w:val="it-IT"/>
-        </w:rPr>
-        <w:t>INTELLIGENZA ARTIFICIALE: D1_intelligenza artificiale.</w:t>
-      </w:r>
-    </w:p>
-    <w:p>
-      <w:pPr>
-        <w:pStyle w:val="Testopreformattatouser"/>
-        <w:rPr>
-          <w:highlight w:val="none"/>
-          <w:shd w:fill="auto" w:val="clear"/>
-        </w:rPr>
-      </w:pPr>
-      <w:r>
-        <w:rPr>
-          <w:rFonts w:cs="Liberation Mono"/>
-          <w:color w:val="000000"/>
-          <w:sz w:val="18"/>
-          <w:szCs w:val="18"/>
-          <w:shd w:fill="auto" w:val="clear"/>
-          <w:lang w:val="it-IT"/>
-        </w:rPr>
-        <w:t xml:space="preserve">  </w:t>
-      </w:r>
-      <w:r>
-        <w:rPr>
-          <w:rFonts w:cs="Liberation Mono"/>
-          <w:color w:val="000000"/>
-          <w:sz w:val="18"/>
-          <w:szCs w:val="18"/>
-          <w:shd w:fill="auto" w:val="clear"/>
-          <w:lang w:val="it-IT"/>
-        </w:rPr>
-        <w:t>PIXEL ART: pixel art</w:t>
-      </w:r>
-      <w:r>
-        <w:rPr>
-          <w:rFonts w:cs="Liberation Mono"/>
-          <w:color w:val="000000"/>
-          <w:sz w:val="18"/>
-          <w:szCs w:val="18"/>
-          <w:shd w:fill="auto" w:val="clear"/>
-          <w:lang w:val="it-IT"/>
-        </w:rPr>
-        <w:t>.</w:t>
+        <w:t>PIXEL ART: pixel art.</w:t>
       </w:r>
     </w:p>
     <w:p>
@@ -2207,7 +2127,29 @@
           <w:shd w:fill="auto" w:val="clear"/>
           <w:lang w:val="it-IT"/>
         </w:rPr>
-        <w:t>GENERICO: informatica, D2_pensiero computazionale, D2_coding, D3_coding, D2_abilità informatiche</w:t>
+        <w:t>GENERICO: informatic</w:t>
+      </w:r>
+      <w:r>
+        <w:rPr>
+          <w:rFonts w:cs="Liberation Mono"/>
+          <w:color w:val="000000"/>
+          <w:sz w:val="18"/>
+          <w:szCs w:val="18"/>
+          <w:shd w:fill="auto" w:val="clear"/>
+          <w:lang w:val="it-IT"/>
+        </w:rPr>
+        <w:t>a, D1_pensiero computazionale, D2_pen</w:t>
+      </w:r>
+      <w:r>
+        <w:rPr>
+          <w:rFonts w:cs="Liberation Mono"/>
+          <w:color w:val="000000"/>
+          <w:sz w:val="18"/>
+          <w:szCs w:val="18"/>
+          <w:shd w:fill="auto" w:val="clear"/>
+          <w:lang w:val="it-IT"/>
+        </w:rPr>
+        <w:t>siero computazionale, D2_coding, D3_coding, D2_abilità informatiche</w:t>
       </w:r>
       <w:r>
         <w:rPr>
@@ -2540,7 +2482,45 @@
           <w:shd w:fill="auto" w:val="clear"/>
           <w:lang w:val="it-IT"/>
         </w:rPr>
-        <w:t>INTELLIGENZA ARTIFICIALE: D2_intelligenza artificiale, uso IA.</w:t>
+        <w:t>INTELLIGENZA ARTIFICIAL</w:t>
+      </w:r>
+      <w:r>
+        <w:rPr>
+          <w:sz w:val="18"/>
+          <w:szCs w:val="18"/>
+          <w:shd w:fill="auto" w:val="clear"/>
+          <w:lang w:val="it-IT"/>
+        </w:rPr>
+        <w:t xml:space="preserve">E: </w:t>
+      </w:r>
+      <w:r>
+        <w:rPr>
+          <w:rFonts w:cs="Liberation Mono"/>
+          <w:color w:val="000000"/>
+          <w:sz w:val="18"/>
+          <w:szCs w:val="18"/>
+          <w:shd w:fill="auto" w:val="clear"/>
+          <w:lang w:val="it-IT"/>
+        </w:rPr>
+        <w:t xml:space="preserve">D1_intelligenza artificiale, </w:t>
+      </w:r>
+      <w:r>
+        <w:rPr>
+          <w:sz w:val="18"/>
+          <w:szCs w:val="18"/>
+          <w:shd w:fill="auto" w:val="clear"/>
+          <w:lang w:val="it-IT"/>
+        </w:rPr>
+        <w:t>D2_int</w:t>
+      </w:r>
+      <w:r>
+        <w:rPr>
+          <w:sz w:val="18"/>
+          <w:szCs w:val="18"/>
+          <w:shd w:fill="auto" w:val="clear"/>
+          <w:lang w:val="it-IT"/>
+        </w:rPr>
+        <w:t>elligenza artificiale, uso IA.</w:t>
       </w:r>
     </w:p>
     <w:p>
@@ -2571,29 +2551,7 @@
           <w:shd w:fill="auto" w:val="clear"/>
           <w:lang w:val="it-IT"/>
         </w:rPr>
-        <w:t xml:space="preserve">RISOLUZIONE COMPUTAZIONALE DEI PROBLEMI: automatizzazione risoluzione di problemi, </w:t>
-      </w:r>
-      <w:r>
-        <w:rPr>
-          <w:rFonts w:cs="Liberation Mono"/>
-          <w:color w:val="000000"/>
-          <w:sz w:val="18"/>
-          <w:szCs w:val="18"/>
-          <w:shd w:fill="auto" w:val="clear"/>
-          <w:lang w:val="it-IT"/>
-        </w:rPr>
-        <w:t>D3_risoluzione di problemi,</w:t>
-      </w:r>
-      <w:r>
-        <w:rPr>
-          <w:rFonts w:cs="Liberation Mono"/>
-          <w:color w:val="000000"/>
-          <w:sz w:val="18"/>
-          <w:szCs w:val="18"/>
-          <w:shd w:fill="auto" w:val="clear"/>
-          <w:lang w:val="it-IT"/>
-        </w:rPr>
-        <w:t xml:space="preserve"> generalizzazione processo di soluzione, programmazione per la risoluzione di problemi, problem posing computazionale</w:t>
+        <w:t>RISOLUZIONE COMPUTAZIONALE DEI PROBLEMI: automatizzazione risoluzione di problemi, D3_risoluzione di problemi, generalizzazione processo di soluzione, programmazione per la risoluzione di problemi, problem posing computazionale</w:t>
       </w:r>
       <w:r>
         <w:rPr>
@@ -3038,7 +2996,7 @@
           <w:shd w:fill="FFFF00" w:val="clear"/>
           <w:lang w:val="it-IT"/>
         </w:rPr>
-        <w:t>focus</w:t>
+        <w:t>focus D2</w:t>
       </w:r>
     </w:p>
     <w:p>
@@ -3421,29 +3379,7 @@
           <w:shd w:fill="auto" w:val="clear"/>
           <w:lang w:val="it-IT"/>
         </w:rPr>
-        <w:t xml:space="preserve">PROCESSI COGNITIVI: pensiero critico, astrazione, analizzare processi, pensiero logico, riflettere sull’esperienza, comprensione di istruzioni, valutazione attendibilità di informazioni, capacità di previsione, osservazione/ memoria/ analisi, </w:t>
-      </w:r>
-      <w:r>
-        <w:rPr>
-          <w:rFonts w:cs="Liberation Mono"/>
-          <w:color w:val="000000"/>
-          <w:sz w:val="18"/>
-          <w:szCs w:val="18"/>
-          <w:shd w:fill="auto" w:val="clear"/>
-          <w:lang w:val="it-IT"/>
-        </w:rPr>
-        <w:t>D1_</w:t>
-      </w:r>
-      <w:r>
-        <w:rPr>
-          <w:rFonts w:cs="Liberation Mono"/>
-          <w:color w:val="000000"/>
-          <w:sz w:val="18"/>
-          <w:szCs w:val="18"/>
-          <w:shd w:fill="auto" w:val="clear"/>
-          <w:lang w:val="it-IT"/>
-        </w:rPr>
-        <w:t>pianificazione.</w:t>
+        <w:t>PROCESSI COGNITIVI: pensiero critico, astrazione, analizzare processi, pensiero logico, riflettere sull’esperienza, comprensione di istruzioni, valutazione attendibilità di informazioni, capacità di previsione, osservazione/ memoria/ analisi, D1_pianificazione.</w:t>
       </w:r>
     </w:p>
     <w:p>
@@ -3505,29 +3441,7 @@
           <w:shd w:fill="auto" w:val="clear"/>
           <w:lang w:val="it-IT"/>
         </w:rPr>
-        <w:t xml:space="preserve">COLLABORAZIONE: D2_cooperative learning, D3_cooperative learning, </w:t>
-      </w:r>
-      <w:r>
-        <w:rPr>
-          <w:rFonts w:cs="Liberation Mono"/>
-          <w:color w:val="000000"/>
-          <w:sz w:val="18"/>
-          <w:szCs w:val="18"/>
-          <w:shd w:fill="auto" w:val="clear"/>
-          <w:lang w:val="it-IT"/>
-        </w:rPr>
-        <w:t>D3_</w:t>
-      </w:r>
-      <w:r>
-        <w:rPr>
-          <w:rFonts w:cs="Liberation Mono"/>
-          <w:color w:val="000000"/>
-          <w:sz w:val="18"/>
-          <w:szCs w:val="18"/>
-          <w:shd w:fill="auto" w:val="clear"/>
-          <w:lang w:val="it-IT"/>
-        </w:rPr>
-        <w:t>collaborazione.</w:t>
+        <w:t>COLLABORAZIONE: D2_cooperative learning, D3_cooperative learning, D3_collaborazione.</w:t>
       </w:r>
     </w:p>
     <w:p>
@@ -3589,128 +3503,7 @@
           <w:shd w:fill="auto" w:val="clear"/>
           <w:lang w:val="it-IT"/>
         </w:rPr>
-        <w:t xml:space="preserve">RELAZIONALE-SOCIALE: </w:t>
-      </w:r>
-      <w:r>
-        <w:rPr>
-          <w:rFonts w:cs="Liberation Mono"/>
-          <w:color w:val="000000"/>
-          <w:sz w:val="18"/>
-          <w:szCs w:val="18"/>
-          <w:shd w:fill="auto" w:val="clear"/>
-          <w:lang w:val="it-IT"/>
-        </w:rPr>
-        <w:t>D3_</w:t>
-      </w:r>
-      <w:r>
-        <w:rPr>
-          <w:rFonts w:cs="Liberation Mono"/>
-          <w:color w:val="000000"/>
-          <w:sz w:val="18"/>
-          <w:szCs w:val="18"/>
-          <w:shd w:fill="auto" w:val="clear"/>
-          <w:lang w:val="it-IT"/>
-        </w:rPr>
-        <w:t xml:space="preserve">capacità di ascolto, </w:t>
-      </w:r>
-      <w:r>
-        <w:rPr>
-          <w:rFonts w:cs="Liberation Mono"/>
-          <w:color w:val="000000"/>
-          <w:sz w:val="18"/>
-          <w:szCs w:val="18"/>
-          <w:shd w:fill="auto" w:val="clear"/>
-          <w:lang w:val="it-IT"/>
-        </w:rPr>
-        <w:t>D3_</w:t>
-      </w:r>
-      <w:r>
-        <w:rPr>
-          <w:rFonts w:cs="Liberation Mono"/>
-          <w:color w:val="000000"/>
-          <w:sz w:val="18"/>
-          <w:szCs w:val="18"/>
-          <w:shd w:fill="auto" w:val="clear"/>
-          <w:lang w:val="it-IT"/>
-        </w:rPr>
-        <w:t xml:space="preserve">empatia, </w:t>
-      </w:r>
-      <w:r>
-        <w:rPr>
-          <w:rFonts w:cs="Liberation Mono"/>
-          <w:color w:val="000000"/>
-          <w:sz w:val="18"/>
-          <w:szCs w:val="18"/>
-          <w:shd w:fill="auto" w:val="clear"/>
-          <w:lang w:val="it-IT"/>
-        </w:rPr>
-        <w:t>D3_</w:t>
-      </w:r>
-      <w:r>
-        <w:rPr>
-          <w:rFonts w:cs="Liberation Mono"/>
-          <w:color w:val="000000"/>
-          <w:sz w:val="18"/>
-          <w:szCs w:val="18"/>
-          <w:shd w:fill="auto" w:val="clear"/>
-          <w:lang w:val="it-IT"/>
-        </w:rPr>
-        <w:t xml:space="preserve">punto di vista dell’altro, </w:t>
-      </w:r>
-      <w:r>
-        <w:rPr>
-          <w:rFonts w:cs="Liberation Mono"/>
-          <w:color w:val="000000"/>
-          <w:sz w:val="18"/>
-          <w:szCs w:val="18"/>
-          <w:shd w:fill="auto" w:val="clear"/>
-          <w:lang w:val="it-IT"/>
-        </w:rPr>
-        <w:t>D3_</w:t>
-      </w:r>
-      <w:r>
-        <w:rPr>
-          <w:rFonts w:cs="Liberation Mono"/>
-          <w:color w:val="000000"/>
-          <w:sz w:val="18"/>
-          <w:szCs w:val="18"/>
-          <w:shd w:fill="auto" w:val="clear"/>
-          <w:lang w:val="it-IT"/>
-        </w:rPr>
-        <w:t xml:space="preserve">capacità relazionali, </w:t>
-      </w:r>
-      <w:r>
-        <w:rPr>
-          <w:rFonts w:cs="Liberation Mono"/>
-          <w:color w:val="000000"/>
-          <w:sz w:val="18"/>
-          <w:szCs w:val="18"/>
-          <w:shd w:fill="auto" w:val="clear"/>
-          <w:lang w:val="it-IT"/>
-        </w:rPr>
-        <w:t>D3_</w:t>
-      </w:r>
-      <w:r>
-        <w:rPr>
-          <w:rFonts w:cs="Liberation Mono"/>
-          <w:color w:val="000000"/>
-          <w:sz w:val="18"/>
-          <w:szCs w:val="18"/>
-          <w:shd w:fill="auto" w:val="clear"/>
-          <w:lang w:val="it-IT"/>
-        </w:rPr>
-        <w:t>inclusione</w:t>
-      </w:r>
-      <w:r>
-        <w:rPr>
-          <w:rFonts w:cs="Liberation Mono"/>
-          <w:color w:val="000000"/>
-          <w:sz w:val="18"/>
-          <w:szCs w:val="18"/>
-          <w:shd w:fill="auto" w:val="clear"/>
-          <w:lang w:val="it-IT"/>
-        </w:rPr>
-        <w:t>.</w:t>
+        <w:t>RELAZIONALE-SOCIALE: D3_capacità di ascolto, D3_empatia, D3_punto di vista dell’altro, D3_capacità relazionali, D3_inclusione.</w:t>
       </w:r>
     </w:p>
     <w:p>
@@ -3834,73 +3627,7 @@
           <w:shd w:fill="auto" w:val="clear"/>
           <w:lang w:val="it-IT"/>
         </w:rPr>
-        <w:t xml:space="preserve">COMUNICAZIONE: comunicare con tecnologia, competenze narrative, </w:t>
-      </w:r>
-      <w:r>
-        <w:rPr>
-          <w:rFonts w:cs="Liberation Mono"/>
-          <w:color w:val="000000"/>
-          <w:sz w:val="18"/>
-          <w:szCs w:val="18"/>
-          <w:shd w:fill="auto" w:val="clear"/>
-          <w:lang w:val="it-IT"/>
-        </w:rPr>
-        <w:t>D1_</w:t>
-      </w:r>
-      <w:r>
-        <w:rPr>
-          <w:rFonts w:cs="Liberation Mono"/>
-          <w:color w:val="000000"/>
-          <w:sz w:val="18"/>
-          <w:szCs w:val="18"/>
-          <w:shd w:fill="auto" w:val="clear"/>
-          <w:lang w:val="it-IT"/>
-        </w:rPr>
-        <w:t xml:space="preserve">capacità di narrazione, comunicazione con linguaggio specifico, descrizione di strategie, </w:t>
-      </w:r>
-      <w:r>
-        <w:rPr>
-          <w:rFonts w:cs="Liberation Mono"/>
-          <w:color w:val="000000"/>
-          <w:sz w:val="18"/>
-          <w:szCs w:val="18"/>
-          <w:shd w:fill="auto" w:val="clear"/>
-          <w:lang w:val="it-IT"/>
-        </w:rPr>
-        <w:t>D3_</w:t>
-      </w:r>
-      <w:r>
-        <w:rPr>
-          <w:rFonts w:cs="Liberation Mono"/>
-          <w:color w:val="000000"/>
-          <w:sz w:val="18"/>
-          <w:szCs w:val="18"/>
-          <w:shd w:fill="auto" w:val="clear"/>
-          <w:lang w:val="it-IT"/>
-        </w:rPr>
-        <w:t xml:space="preserve">utilizzare codici e linguaggi diversi, </w:t>
-      </w:r>
-      <w:r>
-        <w:rPr>
-          <w:rFonts w:cs="Liberation Mono"/>
-          <w:color w:val="000000"/>
-          <w:sz w:val="18"/>
-          <w:szCs w:val="18"/>
-          <w:shd w:fill="auto" w:val="clear"/>
-          <w:lang w:val="it-IT"/>
-        </w:rPr>
-        <w:t>D1_</w:t>
-      </w:r>
-      <w:r>
-        <w:rPr>
-          <w:rFonts w:cs="Liberation Mono"/>
-          <w:color w:val="000000"/>
-          <w:sz w:val="18"/>
-          <w:szCs w:val="18"/>
-          <w:shd w:fill="auto" w:val="clear"/>
-          <w:lang w:val="it-IT"/>
-        </w:rPr>
-        <w:t>presentazione.</w:t>
+        <w:t>COMUNICAZIONE: comunicare con tecnologia, competenze narrative, D1_capacità di narrazione, comunicazione con linguaggio specifico, descrizione di strategie, D3_utilizzare codici e linguaggi diversi, D1_presentazione.</w:t>
       </w:r>
     </w:p>
     <w:p>
@@ -3931,51 +3658,7 @@
           <w:shd w:fill="auto" w:val="clear"/>
           <w:lang w:val="it-IT"/>
         </w:rPr>
-        <w:t xml:space="preserve">COLLABORAZIONE: peer-to-peer, cooperative learning, collaborazione/ lavoro squadra, </w:t>
-      </w:r>
-      <w:r>
-        <w:rPr>
-          <w:rFonts w:cs="Liberation Mono"/>
-          <w:color w:val="000000"/>
-          <w:sz w:val="18"/>
-          <w:szCs w:val="18"/>
-          <w:shd w:fill="auto" w:val="clear"/>
-          <w:lang w:val="it-IT"/>
-        </w:rPr>
-        <w:t>D1_</w:t>
-      </w:r>
-      <w:r>
-        <w:rPr>
-          <w:rFonts w:cs="Liberation Mono"/>
-          <w:color w:val="000000"/>
-          <w:sz w:val="18"/>
-          <w:szCs w:val="18"/>
-          <w:shd w:fill="auto" w:val="clear"/>
-          <w:lang w:val="it-IT"/>
-        </w:rPr>
-        <w:t xml:space="preserve">conversazione collaborativa / collaborazione, </w:t>
-      </w:r>
-      <w:r>
-        <w:rPr>
-          <w:rFonts w:cs="Liberation Mono"/>
-          <w:color w:val="000000"/>
-          <w:sz w:val="18"/>
-          <w:szCs w:val="18"/>
-          <w:shd w:fill="auto" w:val="clear"/>
-          <w:lang w:val="it-IT"/>
-        </w:rPr>
-        <w:t>D1_</w:t>
-      </w:r>
-      <w:r>
-        <w:rPr>
-          <w:rFonts w:cs="Liberation Mono"/>
-          <w:color w:val="000000"/>
-          <w:sz w:val="18"/>
-          <w:szCs w:val="18"/>
-          <w:shd w:fill="auto" w:val="clear"/>
-          <w:lang w:val="it-IT"/>
-        </w:rPr>
-        <w:t>lavoro in coppia.</w:t>
+        <w:t>COLLABORAZIONE: peer-to-peer, cooperative learning, collaborazione/ lavoro squadra, D1_conversazione collaborativa / collaborazione, D1_lavoro in coppia.</w:t>
       </w:r>
     </w:p>
     <w:p>
@@ -4037,117 +3720,7 @@
           <w:shd w:fill="auto" w:val="clear"/>
           <w:lang w:val="it-IT"/>
         </w:rPr>
-        <w:t xml:space="preserve">PROGETTAZIONE E SVILUPPO OGGETTI: </w:t>
-      </w:r>
-      <w:r>
-        <w:rPr>
-          <w:rFonts w:cs="Liberation Mono"/>
-          <w:color w:val="000000"/>
-          <w:sz w:val="18"/>
-          <w:szCs w:val="18"/>
-          <w:shd w:fill="auto" w:val="clear"/>
-          <w:lang w:val="it-IT"/>
-        </w:rPr>
-        <w:t>D3_</w:t>
-      </w:r>
-      <w:r>
-        <w:rPr>
-          <w:rFonts w:cs="Liberation Mono"/>
-          <w:color w:val="000000"/>
-          <w:sz w:val="18"/>
-          <w:szCs w:val="18"/>
-          <w:shd w:fill="auto" w:val="clear"/>
-          <w:lang w:val="it-IT"/>
-        </w:rPr>
-        <w:t xml:space="preserve">smontare oggetti, </w:t>
-      </w:r>
-      <w:r>
-        <w:rPr>
-          <w:rFonts w:cs="Liberation Mono"/>
-          <w:color w:val="000000"/>
-          <w:sz w:val="18"/>
-          <w:szCs w:val="18"/>
-          <w:shd w:fill="auto" w:val="clear"/>
-          <w:lang w:val="it-IT"/>
-        </w:rPr>
-        <w:t>D3_</w:t>
-      </w:r>
-      <w:r>
-        <w:rPr>
-          <w:rFonts w:cs="Liberation Mono"/>
-          <w:color w:val="000000"/>
-          <w:sz w:val="18"/>
-          <w:szCs w:val="18"/>
-          <w:shd w:fill="auto" w:val="clear"/>
-          <w:lang w:val="it-IT"/>
-        </w:rPr>
-        <w:t xml:space="preserve">pianificare fabbricazione oggetti, </w:t>
-      </w:r>
-      <w:r>
-        <w:rPr>
-          <w:rFonts w:cs="Liberation Mono"/>
-          <w:color w:val="000000"/>
-          <w:sz w:val="18"/>
-          <w:szCs w:val="18"/>
-          <w:shd w:fill="auto" w:val="clear"/>
-          <w:lang w:val="it-IT"/>
-        </w:rPr>
-        <w:t>D3_</w:t>
-      </w:r>
-      <w:r>
-        <w:rPr>
-          <w:rFonts w:cs="Liberation Mono"/>
-          <w:color w:val="000000"/>
-          <w:sz w:val="18"/>
-          <w:szCs w:val="18"/>
-          <w:shd w:fill="auto" w:val="clear"/>
-          <w:lang w:val="it-IT"/>
-        </w:rPr>
-        <w:t xml:space="preserve">migliorare oggetti, </w:t>
-      </w:r>
-      <w:r>
-        <w:rPr>
-          <w:rFonts w:cs="Liberation Mono"/>
-          <w:color w:val="000000"/>
-          <w:sz w:val="18"/>
-          <w:szCs w:val="18"/>
-          <w:shd w:fill="auto" w:val="clear"/>
-          <w:lang w:val="it-IT"/>
-        </w:rPr>
-        <w:t>D3_</w:t>
-      </w:r>
-      <w:r>
-        <w:rPr>
-          <w:rFonts w:cs="Liberation Mono"/>
-          <w:color w:val="000000"/>
-          <w:sz w:val="18"/>
-          <w:szCs w:val="18"/>
-          <w:shd w:fill="auto" w:val="clear"/>
-          <w:lang w:val="it-IT"/>
-        </w:rPr>
-        <w:t xml:space="preserve">analizzare oggetti, </w:t>
-      </w:r>
-      <w:r>
-        <w:rPr>
-          <w:rFonts w:cs="Liberation Mono"/>
-          <w:color w:val="000000"/>
-          <w:sz w:val="18"/>
-          <w:szCs w:val="18"/>
-          <w:shd w:fill="auto" w:val="clear"/>
-          <w:lang w:val="it-IT"/>
-        </w:rPr>
-        <w:t>D3_</w:t>
-      </w:r>
-      <w:r>
-        <w:rPr>
-          <w:rFonts w:cs="Liberation Mono"/>
-          <w:color w:val="000000"/>
-          <w:sz w:val="18"/>
-          <w:szCs w:val="18"/>
-          <w:shd w:fill="auto" w:val="clear"/>
-          <w:lang w:val="it-IT"/>
-        </w:rPr>
-        <w:t>riconoscere difetti.</w:t>
+        <w:t>PROGETTAZIONE E SVILUPPO OGGETTI: D3_smontare oggetti, D3_pianificare fabbricazione oggetti, D3_migliorare oggetti, D3_analizzare oggetti, D3_riconoscere difetti.</w:t>
       </w:r>
     </w:p>
     <w:p>
@@ -4189,51 +3762,29 @@
           <w:shd w:fill="auto" w:val="clear"/>
           <w:lang w:val="it-IT"/>
         </w:rPr>
-        <w:t xml:space="preserve">: calcolare, D2_orientamento spaziale, D3_orientamento spaziale, interdisciplinarità, </w:t>
-      </w:r>
-      <w:r>
-        <w:rPr>
-          <w:rFonts w:cs="Liberation Mono"/>
-          <w:color w:val="000000"/>
-          <w:sz w:val="18"/>
-          <w:szCs w:val="18"/>
-          <w:shd w:fill="auto" w:val="clear"/>
-          <w:lang w:val="it-IT"/>
-        </w:rPr>
-        <w:t>D3_</w:t>
-      </w:r>
-      <w:r>
-        <w:rPr>
-          <w:rFonts w:cs="Liberation Mono"/>
-          <w:color w:val="000000"/>
-          <w:sz w:val="18"/>
-          <w:szCs w:val="18"/>
-          <w:shd w:fill="auto" w:val="clear"/>
-          <w:lang w:val="it-IT"/>
-        </w:rPr>
-        <w:t xml:space="preserve">coding per matematica, </w:t>
-      </w:r>
-      <w:r>
-        <w:rPr>
-          <w:rFonts w:cs="Liberation Mono"/>
-          <w:color w:val="000000"/>
-          <w:sz w:val="18"/>
-          <w:szCs w:val="18"/>
-          <w:shd w:fill="auto" w:val="clear"/>
-          <w:lang w:val="it-IT"/>
-        </w:rPr>
-        <w:t>D3_</w:t>
-      </w:r>
-      <w:r>
-        <w:rPr>
-          <w:rFonts w:cs="Liberation Mono"/>
-          <w:color w:val="000000"/>
-          <w:sz w:val="18"/>
-          <w:szCs w:val="18"/>
-          <w:shd w:fill="auto" w:val="clear"/>
-          <w:lang w:val="it-IT"/>
-        </w:rPr>
-        <w:t>concetti matematici.</w:t>
+        <w:t xml:space="preserve">: calcolare, </w:t>
+      </w:r>
+      <w:r>
+        <w:rPr>
+          <w:rFonts w:cs="Liberation Mono"/>
+          <w:color w:val="000000"/>
+          <w:sz w:val="18"/>
+          <w:szCs w:val="18"/>
+          <w:shd w:fill="auto" w:val="clear"/>
+          <w:lang w:val="it-IT"/>
+        </w:rPr>
+        <w:t xml:space="preserve">D1_orientamento spaziale, </w:t>
+      </w:r>
+      <w:r>
+        <w:rPr>
+          <w:rFonts w:cs="Liberation Mono"/>
+          <w:color w:val="000000"/>
+          <w:sz w:val="18"/>
+          <w:szCs w:val="18"/>
+          <w:shd w:fill="auto" w:val="clear"/>
+          <w:lang w:val="it-IT"/>
+        </w:rPr>
+        <w:t>D2_orientamento spaziale, D3_orientamento spaziale, interdisciplinarità, D3_coding per matematica, D3_concetti matematici.</w:t>
       </w:r>
     </w:p>
     <w:p>
@@ -4265,51 +3816,7 @@
           <w:shd w:fill="auto" w:val="clear"/>
           <w:lang w:val="it-IT"/>
         </w:rPr>
-        <w:t xml:space="preserve">CREATIVITÀ: </w:t>
-      </w:r>
-      <w:r>
-        <w:rPr>
-          <w:rFonts w:cs="Liberation Mono"/>
-          <w:color w:val="000000"/>
-          <w:sz w:val="18"/>
-          <w:szCs w:val="18"/>
-          <w:shd w:fill="auto" w:val="clear"/>
-          <w:lang w:val="it-IT"/>
-        </w:rPr>
-        <w:t>D1_</w:t>
-      </w:r>
-      <w:r>
-        <w:rPr>
-          <w:rFonts w:cs="Liberation Mono"/>
-          <w:color w:val="000000"/>
-          <w:sz w:val="18"/>
-          <w:szCs w:val="18"/>
-          <w:shd w:fill="auto" w:val="clear"/>
-          <w:lang w:val="it-IT"/>
-        </w:rPr>
-        <w:t xml:space="preserve">pensiero creativo, </w:t>
-      </w:r>
-      <w:r>
-        <w:rPr>
-          <w:rFonts w:cs="Liberation Mono"/>
-          <w:color w:val="000000"/>
-          <w:sz w:val="18"/>
-          <w:szCs w:val="18"/>
-          <w:shd w:fill="auto" w:val="clear"/>
-          <w:lang w:val="it-IT"/>
-        </w:rPr>
-        <w:t xml:space="preserve">D3_pensiero creativo, </w:t>
-      </w:r>
-      <w:r>
-        <w:rPr>
-          <w:rFonts w:cs="Liberation Mono"/>
-          <w:color w:val="000000"/>
-          <w:sz w:val="18"/>
-          <w:szCs w:val="18"/>
-          <w:shd w:fill="auto" w:val="clear"/>
-          <w:lang w:val="it-IT"/>
-        </w:rPr>
-        <w:t xml:space="preserve">creatività, gioco, </w:t>
+        <w:t xml:space="preserve">CREATIVITÀ: D1_pensiero creativo, D3_pensiero creativo, creatività, gioco, </w:t>
       </w:r>
       <w:r>
         <w:rPr>
@@ -4538,51 +4045,7 @@
           <w:shd w:fill="auto" w:val="clear"/>
           <w:lang w:val="it-IT"/>
         </w:rPr>
-        <w:t xml:space="preserve">GEOGRAFIA: D3_geografia, </w:t>
-      </w:r>
-      <w:r>
-        <w:rPr>
-          <w:rFonts w:cs="Liberation Mono"/>
-          <w:color w:val="000000"/>
-          <w:sz w:val="18"/>
-          <w:szCs w:val="18"/>
-          <w:shd w:fill="auto" w:val="clear"/>
-          <w:lang w:val="it-IT"/>
-        </w:rPr>
-        <w:t>D1_</w:t>
-      </w:r>
-      <w:r>
-        <w:rPr>
-          <w:rFonts w:cs="Liberation Mono"/>
-          <w:color w:val="000000"/>
-          <w:sz w:val="18"/>
-          <w:szCs w:val="18"/>
-          <w:shd w:fill="auto" w:val="clear"/>
-          <w:lang w:val="it-IT"/>
-        </w:rPr>
-        <w:t xml:space="preserve">costruzione di mappe, </w:t>
-      </w:r>
-      <w:r>
-        <w:rPr>
-          <w:rFonts w:cs="Liberation Mono"/>
-          <w:color w:val="000000"/>
-          <w:sz w:val="18"/>
-          <w:szCs w:val="18"/>
-          <w:shd w:fill="auto" w:val="clear"/>
-          <w:lang w:val="it-IT"/>
-        </w:rPr>
-        <w:t>D1_</w:t>
-      </w:r>
-      <w:r>
-        <w:rPr>
-          <w:rFonts w:cs="Liberation Mono"/>
-          <w:color w:val="000000"/>
-          <w:sz w:val="18"/>
-          <w:szCs w:val="18"/>
-          <w:shd w:fill="auto" w:val="clear"/>
-          <w:lang w:val="it-IT"/>
-        </w:rPr>
-        <w:t>mappe.</w:t>
+        <w:t>GEOGRAFIA: D3_geografia, D1_costruzione di mappe, D1_mappe.</w:t>
       </w:r>
     </w:p>
     <w:p>
@@ -4674,29 +4137,7 @@
           <w:shd w:fill="auto" w:val="clear"/>
           <w:lang w:val="it-IT"/>
         </w:rPr>
-        <w:t xml:space="preserve">MATEMATICA: spazio e figure, D3_geometria, matematica, operazioni retta dei numeri, rappresentazione dei dati, contorno di figura piana, sequenzialità, lato, modelli geometrici, </w:t>
-      </w:r>
-      <w:r>
-        <w:rPr>
-          <w:rFonts w:cs="Liberation Mono"/>
-          <w:color w:val="000000"/>
-          <w:sz w:val="18"/>
-          <w:szCs w:val="18"/>
-          <w:shd w:fill="auto" w:val="clear"/>
-          <w:lang w:val="it-IT"/>
-        </w:rPr>
-        <w:t>D1_</w:t>
-      </w:r>
-      <w:r>
-        <w:rPr>
-          <w:rFonts w:cs="Liberation Mono"/>
-          <w:color w:val="000000"/>
-          <w:sz w:val="18"/>
-          <w:szCs w:val="18"/>
-          <w:shd w:fill="auto" w:val="clear"/>
-          <w:lang w:val="it-IT"/>
-        </w:rPr>
-        <w:t>conteggio.</w:t>
+        <w:t>MATEMATICA: spazio e figure, D3_geometria, matematica, operazioni retta dei numeri, rappresentazione dei dati, contorno di figura piana, sequenzialità, lato, modelli geometrici, D1_conteggio.</w:t>
       </w:r>
     </w:p>
     <w:p>
@@ -4898,7 +4339,7 @@
           <w:shd w:fill="FFFF00" w:val="clear"/>
           <w:lang w:val="it-IT"/>
         </w:rPr>
-        <w:t>risposta generica 3</w:t>
+        <w:t>risposta generica D3</w:t>
       </w:r>
     </w:p>
     <w:p>

</xml_diff>